<commit_message>
Edited format of my AI disclosure. Added FRL_creation_process.txt. Altered README.md to take it into account, and also edited by project contributions.
</commit_message>
<xml_diff>
--- a/report_condensed.docx
+++ b/report_condensed.docx
@@ -778,12 +778,21 @@
         <w:pStyle w:val="Heading1"/>
       </w:pPr>
       <w:r>
+        <w:lastRenderedPageBreak/>
         <w:t>II. Exploratory Data Analysis &amp; Data Preparation</w:t>
       </w:r>
     </w:p>
     <w:p>
       <w:r>
-        <w:t>The dataset contains 10,459 rows and 24 features. The target variable, RiskPerformance, classifies each applicant as “Good” or “Bad.” All predictors are numeric. After initial cleaning, the target classes are reasonably balanced: 52% Bad (5,136) and 48% Good (4,735), requiring no rebalancing techniques.</w:t>
+        <w:t xml:space="preserve">The dataset contains 10,459 rows and 24 features. The target variable, </w:t>
+      </w:r>
+      <w:proofErr w:type="spellStart"/>
+      <w:r>
+        <w:t>RiskPerformance</w:t>
+      </w:r>
+      <w:proofErr w:type="spellEnd"/>
+      <w:r>
+        <w:t>, classifies each applicant as “Good” or “Bad.” All predictors are numeric. After initial cleaning, the target classes are reasonably balanced: 52% Bad (5,136) and 48% Good (4,735), requiring no rebalancing techniques.</w:t>
       </w:r>
     </w:p>
     <w:p>
@@ -796,12 +805,36 @@
     </w:p>
     <w:p>
       <w:r>
-        <w:t>The dataset encodes missing data through sentinel codes: -9 (“No Bureau Record or No Investigation”) and -8 (“No Usable/Valid Trades or Inquiries”). A third code, -7 (“Condition Not Met”), is present in MSinceMostRecentDelq and MSinceMostRecentInqexcl7days and was set aside for separate treatment because it carries meaningful information rather than representing truly absent data.</w:t>
+        <w:t xml:space="preserve">The dataset encodes missing data through sentinel codes: -9 (“No Bureau Record or No Investigation”) and -8 (“No Usable/Valid Trades or Inquiries”). A third code, -7 (“Condition Not Met”), is present in </w:t>
+      </w:r>
+      <w:proofErr w:type="spellStart"/>
+      <w:r>
+        <w:t>MSinceMostRecentDelq</w:t>
+      </w:r>
+      <w:proofErr w:type="spellEnd"/>
+      <w:r>
+        <w:t xml:space="preserve"> and MSinceMostRecentInqexcl7days and was set aside for separate treatment because it carries meaningful information rather than representing truly absent data.</w:t>
       </w:r>
     </w:p>
     <w:p>
       <w:r>
-        <w:t>We removed 588 rows (5.6%) in which every numeric predictor was sentinel-coded, leaving 9,871 rows. The remaining -9 and -8 values were converted to NaN. At the column level, only NetFractionInstallBurden had moderate missingness (34.64%); all other features were under 10%. At the row level, average missingness per row was 2.7%, with no row exceeding 30.4%. No additional rows were dropped.</w:t>
+        <w:t xml:space="preserve">We removed 588 rows (5.6%) in which every numeric predictor was sentinel-coded, leaving 9,871 rows. The remaining -9 and -8 values were converted to </w:t>
+      </w:r>
+      <w:proofErr w:type="spellStart"/>
+      <w:r>
+        <w:t>NaN</w:t>
+      </w:r>
+      <w:proofErr w:type="spellEnd"/>
+      <w:r>
+        <w:t xml:space="preserve">. At the column level, only </w:t>
+      </w:r>
+      <w:proofErr w:type="spellStart"/>
+      <w:r>
+        <w:t>NetFractionInstallBurden</w:t>
+      </w:r>
+      <w:proofErr w:type="spellEnd"/>
+      <w:r>
+        <w:t xml:space="preserve"> had moderate missingness (34.64%); all other features were under 10%. At the row level, average missingness per row was 2.7%, with no row exceeding 30.4%. No additional rows were dropped.</w:t>
       </w:r>
     </w:p>
     <w:p>
@@ -831,7 +864,31 @@
     </w:p>
     <w:p>
       <w:r>
-        <w:t>We flagged predictor pairs with absolute correlation above 0.8. Three clusters were identified: NumInqLast6M and NumInqLast6Mexcl7days (0.992), NumTrades60Ever2DerogPubRec and NumTrades90Ever2DerogPubRec (0.890), and NumSatisfactoryTrades and NumTotalTrades (0.846). We dropped NumInqLast6Mexcl7days, NumTrades90Ever2DerogPubRec, and NumTotalTrades, bringing the dataset to 20 predictor features.</w:t>
+        <w:t xml:space="preserve">We flagged predictor pairs with absolute correlation above 0.8. Three clusters were identified: NumInqLast6M and NumInqLast6Mexcl7days (0.992), NumTrades60Ever2DerogPubRec and NumTrades90Ever2DerogPubRec (0.890), and </w:t>
+      </w:r>
+      <w:proofErr w:type="spellStart"/>
+      <w:r>
+        <w:t>NumSatisfactoryTrades</w:t>
+      </w:r>
+      <w:proofErr w:type="spellEnd"/>
+      <w:r>
+        <w:t xml:space="preserve"> and </w:t>
+      </w:r>
+      <w:proofErr w:type="spellStart"/>
+      <w:r>
+        <w:t>NumTotalTrades</w:t>
+      </w:r>
+      <w:proofErr w:type="spellEnd"/>
+      <w:r>
+        <w:t xml:space="preserve"> (0.846). We dropped NumInqLast6Mexcl7days, NumTrades90Ever2DerogPubRec, and </w:t>
+      </w:r>
+      <w:proofErr w:type="spellStart"/>
+      <w:r>
+        <w:t>NumTotalTrades</w:t>
+      </w:r>
+      <w:proofErr w:type="spellEnd"/>
+      <w:r>
+        <w:t>, bringing the dataset to 20 predictor features.</w:t>
       </w:r>
     </w:p>
     <w:p>
@@ -844,12 +901,124 @@
     </w:p>
     <w:p>
       <w:r>
-        <w:t>We computed each remaining feature’s correlation with the binary target. The strongest linear predictors were ExternalRiskEstimate (−0.460), NetFractionRevolvingBurden (0.356), PercentTradesWBalance (0.279), PercentTradesNeverDelq (−0.257), NumBank2NatlTradesWHighUtilization (0.246), and AverageMInFile (−0.244). Moderate predictors included MaxDelq2PublicRecLast12M (−0.237), MaxDelqEver (−0.217), and MSinceOldestTradeOpen (−0.216). The weakest were NumInqLast6M (0.144), NumSatisfactoryTrades (−0.141), and PercentInstallTrades (0.140). The signs are economically intuitive: higher risk scores, longer credit histories, and fewer delinquencies reduce risk, while higher revolving burden and more recent inquiries increase it. No single feature dominates, confirming that a multivariate model is necessary.</w:t>
+        <w:t xml:space="preserve">We computed each remaining feature’s correlation with the binary target. The strongest linear predictors were </w:t>
+      </w:r>
+      <w:proofErr w:type="spellStart"/>
+      <w:r>
+        <w:t>ExternalRiskEstimate</w:t>
+      </w:r>
+      <w:proofErr w:type="spellEnd"/>
+      <w:r>
+        <w:t xml:space="preserve"> (−0.460), </w:t>
+      </w:r>
+      <w:proofErr w:type="spellStart"/>
+      <w:r>
+        <w:t>NetFractionRevolvingBurden</w:t>
+      </w:r>
+      <w:proofErr w:type="spellEnd"/>
+      <w:r>
+        <w:t xml:space="preserve"> (0.356), </w:t>
+      </w:r>
+      <w:proofErr w:type="spellStart"/>
+      <w:r>
+        <w:t>PercentTradesWBalance</w:t>
+      </w:r>
+      <w:proofErr w:type="spellEnd"/>
+      <w:r>
+        <w:t xml:space="preserve"> (0.279), </w:t>
+      </w:r>
+      <w:proofErr w:type="spellStart"/>
+      <w:r>
+        <w:t>PercentTradesNeverDelq</w:t>
+      </w:r>
+      <w:proofErr w:type="spellEnd"/>
+      <w:r>
+        <w:t xml:space="preserve"> (−0.257), NumBank2NatlTradesWHighUtilization (0.246), and </w:t>
+      </w:r>
+      <w:proofErr w:type="spellStart"/>
+      <w:r>
+        <w:t>AverageMInFile</w:t>
+      </w:r>
+      <w:proofErr w:type="spellEnd"/>
+      <w:r>
+        <w:t xml:space="preserve"> (−0.244). Moderate predictors included MaxDelq2PublicRecLast12M (−0.237), </w:t>
+      </w:r>
+      <w:proofErr w:type="spellStart"/>
+      <w:r>
+        <w:t>MaxDelqEver</w:t>
+      </w:r>
+      <w:proofErr w:type="spellEnd"/>
+      <w:r>
+        <w:t xml:space="preserve"> (−0.217), and </w:t>
+      </w:r>
+      <w:proofErr w:type="spellStart"/>
+      <w:r>
+        <w:t>MSinceOldestTradeOpen</w:t>
+      </w:r>
+      <w:proofErr w:type="spellEnd"/>
+      <w:r>
+        <w:t xml:space="preserve"> (−0.216). The weakest were NumInqLast6M (0.144), </w:t>
+      </w:r>
+      <w:proofErr w:type="spellStart"/>
+      <w:r>
+        <w:t>NumSatisfactoryTrades</w:t>
+      </w:r>
+      <w:proofErr w:type="spellEnd"/>
+      <w:r>
+        <w:t xml:space="preserve"> (−0.141), and </w:t>
+      </w:r>
+      <w:proofErr w:type="spellStart"/>
+      <w:r>
+        <w:t>PercentInstallTrades</w:t>
+      </w:r>
+      <w:proofErr w:type="spellEnd"/>
+      <w:r>
+        <w:t xml:space="preserve"> (0.140). The signs are economically intuitive: higher risk scores, longer credit histories, and fewer delinquencies reduce risk, while higher revolving burden and more recent inquiries increase it. No single feature dominates, confirming that a multivariate model is necessary.</w:t>
       </w:r>
     </w:p>
     <w:p>
       <w:r>
-        <w:t>Mean comparisons by class confirmed these relationships. The strongest separations appeared in NetFractionRevolvingBurden (Bad: 43.3 vs. Good: 24.0), ExternalRiskEstimate (67.6 vs. 76.8), MSinceOldestTradeOpen (175.7 vs. 217.4 months), AverageMInFile (70.8 vs. 87.4), and PercentTradesWBalance (72.1 vs. 60.0). Bad applicants had roughly twice as many derogatory marks as Good applicants.</w:t>
+        <w:t xml:space="preserve">Mean comparisons by class confirmed these relationships. The strongest separations appeared in </w:t>
+      </w:r>
+      <w:proofErr w:type="spellStart"/>
+      <w:r>
+        <w:t>NetFractionRevolvingBurden</w:t>
+      </w:r>
+      <w:proofErr w:type="spellEnd"/>
+      <w:r>
+        <w:t xml:space="preserve"> (Bad: 43.3 vs. Good: 24.0), </w:t>
+      </w:r>
+      <w:proofErr w:type="spellStart"/>
+      <w:r>
+        <w:t>ExternalRiskEstimate</w:t>
+      </w:r>
+      <w:proofErr w:type="spellEnd"/>
+      <w:r>
+        <w:t xml:space="preserve"> (67.6 vs. 76.8), </w:t>
+      </w:r>
+      <w:proofErr w:type="spellStart"/>
+      <w:r>
+        <w:t>MSinceOldestTradeOpen</w:t>
+      </w:r>
+      <w:proofErr w:type="spellEnd"/>
+      <w:r>
+        <w:t xml:space="preserve"> (175.7 vs. 217.4 months), </w:t>
+      </w:r>
+      <w:proofErr w:type="spellStart"/>
+      <w:r>
+        <w:t>AverageMInFile</w:t>
+      </w:r>
+      <w:proofErr w:type="spellEnd"/>
+      <w:r>
+        <w:t xml:space="preserve"> (70.8 vs. 87.4), and </w:t>
+      </w:r>
+      <w:proofErr w:type="spellStart"/>
+      <w:r>
+        <w:t>PercentTradesWBalance</w:t>
+      </w:r>
+      <w:proofErr w:type="spellEnd"/>
+      <w:r>
+        <w:t xml:space="preserve"> (72.1 vs. 60.0). Bad applicants had roughly twice as many derogatory marks as Good applicants.</w:t>
       </w:r>
     </w:p>
     <w:p>
@@ -857,12 +1026,34 @@
         <w:pStyle w:val="Heading2"/>
       </w:pPr>
       <w:r>
+        <w:lastRenderedPageBreak/>
         <w:t>D. Distributional Characteristics and Outliers</w:t>
       </w:r>
     </w:p>
     <w:p>
-      <w:r>
-        <w:t>ExternalRiskEstimate is approximately bell-shaped and does not require transformation. NetFractionRevolvingBurden is strongly right-skewed with a tail beyond 200. PercentTradesNeverDelq is heavily concentrated near 100 with a left tail. Using IQR-based outlier detection, several features showed substantial extreme values (e.g., MSinceMostRecentInqexcl7days: 3,821 observations), but these are count-based and naturally right-skewed, so high values likely represent genuine high-risk behavior. We did not remove outliers.</w:t>
+      <w:proofErr w:type="spellStart"/>
+      <w:r>
+        <w:t>ExternalRiskEstimate</w:t>
+      </w:r>
+      <w:proofErr w:type="spellEnd"/>
+      <w:r>
+        <w:t xml:space="preserve"> is approximately bell-shaped and does not require transformation. </w:t>
+      </w:r>
+      <w:proofErr w:type="spellStart"/>
+      <w:r>
+        <w:t>NetFractionRevolvingBurden</w:t>
+      </w:r>
+      <w:proofErr w:type="spellEnd"/>
+      <w:r>
+        <w:t xml:space="preserve"> is strongly right-skewed with a tail beyond 200. </w:t>
+      </w:r>
+      <w:proofErr w:type="spellStart"/>
+      <w:r>
+        <w:t>PercentTradesNeverDelq</w:t>
+      </w:r>
+      <w:proofErr w:type="spellEnd"/>
+      <w:r>
+        <w:t xml:space="preserve"> is heavily concentrated near 100 with a left tail. Using IQR-based outlier detection, several features showed substantial extreme values (e.g., MSinceMostRecentInqexcl7days: 3,821 observations), but these are count-based and naturally right-skewed, so high values likely represent genuine high-risk behavior. We did not remove outliers.</w:t>
       </w:r>
     </w:p>
     <w:p>
@@ -875,7 +1066,23 @@
     </w:p>
     <w:p>
       <w:r>
-        <w:t>All remaining NaN values (formerly -9 and -8 sentinel codes) were imputed with column medians. The -7 values in MSinceMostRecentDelq and MSinceMostRecentInqexcl7days were replaced with each column’s maximum plus one standard deviation, encoding “condition never met” as a very long time since the event. This preserves monotonic ordering</w:t>
+        <w:t xml:space="preserve">All remaining </w:t>
+      </w:r>
+      <w:proofErr w:type="spellStart"/>
+      <w:r>
+        <w:t>NaN</w:t>
+      </w:r>
+      <w:proofErr w:type="spellEnd"/>
+      <w:r>
+        <w:t xml:space="preserve"> values (formerly -9 and -8 sentinel codes) were imputed with column medians. The -7 values in </w:t>
+      </w:r>
+      <w:proofErr w:type="spellStart"/>
+      <w:r>
+        <w:t>MSinceMostRecentDelq</w:t>
+      </w:r>
+      <w:proofErr w:type="spellEnd"/>
+      <w:r>
+        <w:t xml:space="preserve"> and MSinceMostRecentInqexcl7days were replaced with each column’s maximum plus one standard deviation, encoding “condition never met” as a very long time since the event. This preserves monotonic ordering</w:t>
       </w:r>
       <w:r>
         <w:t xml:space="preserve"> </w:t>
@@ -919,7 +1126,15 @@
     </w:p>
     <w:p>
       <w:r>
-        <w:t>We tested logistic regression, a decision tree, XGBoost, a random forest, and a falling rule list (FRL). SVM and KNN were excluded due to interpretability limitations and expected lower performance. Our investigation was split between the FRL, to allow for lower performance in exchange for interpretability, and the higher performance options.</w:t>
+        <w:t xml:space="preserve">We tested logistic regression, a decision tree, </w:t>
+      </w:r>
+      <w:proofErr w:type="spellStart"/>
+      <w:r>
+        <w:t>XGBoost</w:t>
+      </w:r>
+      <w:proofErr w:type="spellEnd"/>
+      <w:r>
+        <w:t>, a random forest, and a falling rule list (FRL). SVM and KNN were excluded due to interpretability limitations and expected lower performance. Our investigation was split between the FRL, to allow for lower performance in exchange for interpretability, and the higher performance options.</w:t>
       </w:r>
     </w:p>
     <w:p>
@@ -963,7 +1178,43 @@
         <w:t>23</w:t>
       </w:r>
       <w:r>
-        <w:t xml:space="preserve"> with precision of 0.7517. The precision advantage at comparable F-Beta is the decisive difference. As discussed in Part I, in close calls we favor higher precision. Our selected random forest uses a rejection threshold of 0.55 with hyperparameters: max_depth: 10, min_samples_leaf: 2, min_samples_split: 10, n_estimators: 300.</w:t>
+        <w:t xml:space="preserve"> with precision of 0.7517. The precision advantage at comparable F-Beta is the decisive difference. As discussed in Part I, in close calls we favor higher </w:t>
+      </w:r>
+      <w:r>
+        <w:lastRenderedPageBreak/>
+        <w:t xml:space="preserve">precision. Our selected random forest uses a rejection threshold of 0.55 with hyperparameters: </w:t>
+      </w:r>
+      <w:proofErr w:type="spellStart"/>
+      <w:r>
+        <w:t>max_depth</w:t>
+      </w:r>
+      <w:proofErr w:type="spellEnd"/>
+      <w:r>
+        <w:t xml:space="preserve">: 10, </w:t>
+      </w:r>
+      <w:proofErr w:type="spellStart"/>
+      <w:r>
+        <w:t>min_samples_leaf</w:t>
+      </w:r>
+      <w:proofErr w:type="spellEnd"/>
+      <w:r>
+        <w:t xml:space="preserve">: 2, </w:t>
+      </w:r>
+      <w:proofErr w:type="spellStart"/>
+      <w:r>
+        <w:t>min_samples_split</w:t>
+      </w:r>
+      <w:proofErr w:type="spellEnd"/>
+      <w:r>
+        <w:t xml:space="preserve">: 10, </w:t>
+      </w:r>
+      <w:proofErr w:type="spellStart"/>
+      <w:r>
+        <w:t>n_estimators</w:t>
+      </w:r>
+      <w:proofErr w:type="spellEnd"/>
+      <w:r>
+        <w:t>: 300.</w:t>
       </w:r>
     </w:p>
     <w:p>
@@ -1003,7 +1254,31 @@
         <w:t>,</w:t>
       </w:r>
       <w:r>
-        <w:t xml:space="preserve"> with five-fold cross validation within the training set. Generative AI (Claude Opus 4.6) was used to recreate the algorithm from “An Optimization Approach to Learning Falling Rule Lists” (Chen &amp; Rudin 2018), originally stored in the outdated repository github.com/cfchen-duke/FRLOptimization. The maximum number of conditions per rule was extended to 3, and a Tree-structured Parzen Estimator (TPE) replaced grid search for hyperparameter tuning.</w:t>
+        <w:t xml:space="preserve"> with five-fold cross validation within the training set. Generative AI (Claude Opus 4.6) was used to recreate the algorithm from “An Optimization Approach to Learning Falling Rule Lists” (Chen &amp; Rudin 2018), originally stored in the outdated repository github.com/</w:t>
+      </w:r>
+      <w:proofErr w:type="spellStart"/>
+      <w:r>
+        <w:t>cfchen</w:t>
+      </w:r>
+      <w:proofErr w:type="spellEnd"/>
+      <w:r>
+        <w:t>-duke/</w:t>
+      </w:r>
+      <w:proofErr w:type="spellStart"/>
+      <w:r>
+        <w:t>FRLOptimization</w:t>
+      </w:r>
+      <w:proofErr w:type="spellEnd"/>
+      <w:r>
+        <w:t xml:space="preserve">. The maximum number of conditions per rule was extended to 3, and a Tree-structured </w:t>
+      </w:r>
+      <w:proofErr w:type="spellStart"/>
+      <w:r>
+        <w:t>Parzen</w:t>
+      </w:r>
+      <w:proofErr w:type="spellEnd"/>
+      <w:r>
+        <w:t xml:space="preserve"> Estimator (TPE) replaced grid search for hyperparameter tuning.</w:t>
       </w:r>
     </w:p>
     <w:p>
@@ -1022,7 +1297,47 @@
     </w:p>
     <w:p>
       <w:r>
-        <w:t>Hyperparameters: max_rules: 28, min_support_frac: 0.0362, n_thresholds: 20, max_coverage_frac: 0.6239, prob_gap: 0.0042.</w:t>
+        <w:t xml:space="preserve">Hyperparameters: </w:t>
+      </w:r>
+      <w:proofErr w:type="spellStart"/>
+      <w:r>
+        <w:t>max_rules</w:t>
+      </w:r>
+      <w:proofErr w:type="spellEnd"/>
+      <w:r>
+        <w:t xml:space="preserve">: 28, </w:t>
+      </w:r>
+      <w:proofErr w:type="spellStart"/>
+      <w:r>
+        <w:t>min_support_frac</w:t>
+      </w:r>
+      <w:proofErr w:type="spellEnd"/>
+      <w:r>
+        <w:t xml:space="preserve">: 0.0362, </w:t>
+      </w:r>
+      <w:proofErr w:type="spellStart"/>
+      <w:r>
+        <w:t>n_thresholds</w:t>
+      </w:r>
+      <w:proofErr w:type="spellEnd"/>
+      <w:r>
+        <w:t xml:space="preserve">: 20, </w:t>
+      </w:r>
+      <w:proofErr w:type="spellStart"/>
+      <w:r>
+        <w:t>max_coverage_frac</w:t>
+      </w:r>
+      <w:proofErr w:type="spellEnd"/>
+      <w:r>
+        <w:t xml:space="preserve">: 0.6239, </w:t>
+      </w:r>
+      <w:proofErr w:type="spellStart"/>
+      <w:r>
+        <w:t>prob_gap</w:t>
+      </w:r>
+      <w:proofErr w:type="spellEnd"/>
+      <w:r>
+        <w:t>: 0.0042.</w:t>
       </w:r>
     </w:p>
     <w:p>
@@ -1221,6 +1536,7 @@
         <w:pStyle w:val="Heading1"/>
       </w:pPr>
       <w:r>
+        <w:lastRenderedPageBreak/>
         <w:t>IV. Model Robustness &amp; Monitoring</w:t>
       </w:r>
     </w:p>
@@ -1269,8 +1585,26 @@
       </w:r>
     </w:p>
     <w:p>
-      <w:r>
-        <w:t xml:space="preserve">Ethan Pochna: I used AI </w:t>
+      <w:pPr>
+        <w:spacing w:after="0"/>
+        <w:rPr>
+          <w:rFonts w:eastAsia="Times New Roman" w:cs="Times New Roman"/>
+          <w:b/>
+          <w:bCs/>
+        </w:rPr>
+      </w:pPr>
+      <w:r>
+        <w:rPr>
+          <w:rFonts w:eastAsia="Times New Roman" w:cs="Times New Roman"/>
+          <w:b/>
+          <w:bCs/>
+        </w:rPr>
+        <w:t>Ethan</w:t>
+      </w:r>
+    </w:p>
+    <w:p>
+      <w:r>
+        <w:t xml:space="preserve"> I used AI </w:t>
       </w:r>
       <w:r>
         <w:t xml:space="preserve">(Claude, Opus </w:t>
@@ -1279,7 +1613,25 @@
         <w:t>4.6)</w:t>
       </w:r>
       <w:r>
-        <w:t xml:space="preserve"> to compose the falling rule list algorithm and tuning scripts; to include F(0.72) in the tuning code of my group members; to condense Task 2 in the .ipynb into Part 2 in the report; to confirm the correctness of several aspects of our work and thought process; to walk through the cost analysis and identify F(0.72) as an ideal metric; to compose the savings per F-Beta score table; to condense an 8-page version of the report into 5 pages; </w:t>
+        <w:t xml:space="preserve"> to compose the falling rule list algorithm and tuning scripts; to include F(0.72) in the tuning code of my group members; to condense Task 2 in the .</w:t>
+      </w:r>
+      <w:proofErr w:type="spellStart"/>
+      <w:r>
+        <w:t>ipynb</w:t>
+      </w:r>
+      <w:proofErr w:type="spellEnd"/>
+      <w:r>
+        <w:t xml:space="preserve"> into Part 2 in the report; to confirm the correctness of several aspects of our work and thought process; to walk through the cost analysis and identify F(0.72) as an ideal metric; to compose the savings per F-Beta score table; to </w:t>
+      </w:r>
+      <w:r>
+        <w:lastRenderedPageBreak/>
+        <w:t>condense an 8-page version of the report</w:t>
+      </w:r>
+      <w:r>
+        <w:t xml:space="preserve"> written manually</w:t>
+      </w:r>
+      <w:r>
+        <w:t xml:space="preserve"> into 5 pages; </w:t>
       </w:r>
       <w:r>
         <w:t xml:space="preserve">and </w:t>
@@ -1357,7 +1709,21 @@
         <w:rPr>
           <w:rFonts w:eastAsia="Times New Roman" w:cs="Times New Roman"/>
         </w:rPr>
-        <w:t xml:space="preserve"> Used Gemini and ChatGPT to assist in developing the Streamlit interface, including layout design, styling adjustments, and refinement of decision rule logic within the application. All implementation decisions and final functionality were reviewed and tested by the team.</w:t>
+        <w:t xml:space="preserve"> Used Gemini and ChatGPT to assist in developing the </w:t>
+      </w:r>
+      <w:proofErr w:type="spellStart"/>
+      <w:r>
+        <w:rPr>
+          <w:rFonts w:eastAsia="Times New Roman" w:cs="Times New Roman"/>
+        </w:rPr>
+        <w:t>Streamlit</w:t>
+      </w:r>
+      <w:proofErr w:type="spellEnd"/>
+      <w:r>
+        <w:rPr>
+          <w:rFonts w:eastAsia="Times New Roman" w:cs="Times New Roman"/>
+        </w:rPr>
+        <w:t xml:space="preserve"> interface, including layout design, styling adjustments, and refinement of decision rule logic within the application. All implementation decisions and final functionality were reviewed and tested by the team.</w:t>
       </w:r>
     </w:p>
     <w:p/>

</xml_diff>